<commit_message>
Recovered app and completed custom period tracker
</commit_message>
<xml_diff>
--- a/herhealthtracker.docx
+++ b/herhealthtracker.docx
@@ -11,6 +11,18 @@
           <w:szCs w:val="40"/>
         </w:rPr>
       </w:pPr>
+      <w:hyperlink r:id="rId4" w:history="1">
+        <w:r>
+          <w:rPr>
+            <w:rStyle w:val="Hyperlink"/>
+            <w:b/>
+            <w:bCs/>
+            <w:sz w:val="40"/>
+            <w:szCs w:val="40"/>
+          </w:rPr>
+          <w:t>http://localhost:5173/-</w:t>
+        </w:r>
+      </w:hyperlink>
       <w:r>
         <w:rPr>
           <w:b/>
@@ -18,90 +30,24 @@
           <w:sz w:val="40"/>
           <w:szCs w:val="40"/>
         </w:rPr>
-        <w:fldChar w:fldCharType="begin"/>
-      </w:r>
-      <w:r>
+        <w:t xml:space="preserve"> my web </w:t>
+      </w:r>
+    </w:p>
+    <w:p>
+      <w:pPr>
         <w:rPr>
           <w:b/>
           <w:bCs/>
           <w:sz w:val="40"/>
           <w:szCs w:val="40"/>
         </w:rPr>
-        <w:instrText>HYPERLINK "</w:instrText>
-      </w:r>
-      <w:r>
-        <w:rPr>
-          <w:b/>
-          <w:bCs/>
-          <w:sz w:val="40"/>
-          <w:szCs w:val="40"/>
-        </w:rPr>
-        <w:instrText>http://localhost:5173/</w:instrText>
-      </w:r>
-      <w:r>
-        <w:rPr>
-          <w:b/>
-          <w:bCs/>
-          <w:sz w:val="40"/>
-          <w:szCs w:val="40"/>
-        </w:rPr>
-        <w:instrText>-"</w:instrText>
-      </w:r>
-      <w:r>
-        <w:rPr>
-          <w:b/>
-          <w:bCs/>
-          <w:sz w:val="40"/>
-          <w:szCs w:val="40"/>
-        </w:rPr>
-        <w:fldChar w:fldCharType="separate"/>
-      </w:r>
-      <w:r>
-        <w:rPr>
-          <w:rStyle w:val="Hyperlink"/>
-          <w:b/>
-          <w:bCs/>
-          <w:sz w:val="40"/>
-          <w:szCs w:val="40"/>
-        </w:rPr>
-        <w:t>http://localhost:5173/</w:t>
-      </w:r>
-      <w:r>
-        <w:rPr>
-          <w:rStyle w:val="Hyperlink"/>
-          <w:b/>
-          <w:bCs/>
-          <w:sz w:val="40"/>
-          <w:szCs w:val="40"/>
-        </w:rPr>
-        <w:t>-</w:t>
-      </w:r>
-      <w:r>
-        <w:rPr>
-          <w:b/>
-          <w:bCs/>
-          <w:sz w:val="40"/>
-          <w:szCs w:val="40"/>
-        </w:rPr>
-        <w:fldChar w:fldCharType="end"/>
-      </w:r>
-      <w:r>
-        <w:rPr>
-          <w:b/>
-          <w:bCs/>
-          <w:sz w:val="40"/>
-          <w:szCs w:val="40"/>
-        </w:rPr>
-        <w:t xml:space="preserve"> my web </w:t>
-      </w:r>
+      </w:pPr>
     </w:p>
     <w:p>
       <w:pPr>
         <w:rPr>
           <w:b/>
           <w:bCs/>
-          <w:sz w:val="40"/>
-          <w:szCs w:val="40"/>
         </w:rPr>
       </w:pPr>
     </w:p>
@@ -128,6 +74,110 @@
           <w:bCs/>
         </w:rPr>
       </w:pPr>
+      <w:r>
+        <w:rPr>
+          <w:b/>
+          <w:bCs/>
+        </w:rPr>
+        <w:t>Week 1 – Setup &amp; Landing Page</w:t>
+      </w:r>
+    </w:p>
+    <w:p>
+      <w:r>
+        <w:rPr>
+          <w:b/>
+          <w:bCs/>
+        </w:rPr>
+        <w:t>Day 1:</w:t>
+      </w:r>
+      <w:r>
+        <w:t xml:space="preserve"> Initialize React project with Vite</w:t>
+      </w:r>
+      <w:r>
+        <w:br/>
+      </w:r>
+      <w:r>
+        <w:rPr>
+          <w:b/>
+          <w:bCs/>
+        </w:rPr>
+        <w:t>Day 2:</w:t>
+      </w:r>
+      <w:r>
+        <w:t xml:space="preserve"> Create project folder structure</w:t>
+      </w:r>
+      <w:r>
+        <w:br/>
+      </w:r>
+      <w:r>
+        <w:rPr>
+          <w:b/>
+          <w:bCs/>
+        </w:rPr>
+        <w:t>Day 3:</w:t>
+      </w:r>
+      <w:r>
+        <w:t xml:space="preserve"> Design color palette and typography system</w:t>
+      </w:r>
+      <w:r>
+        <w:br/>
+      </w:r>
+      <w:r>
+        <w:rPr>
+          <w:b/>
+          <w:bCs/>
+        </w:rPr>
+        <w:t>Day 4:</w:t>
+      </w:r>
+      <w:r>
+        <w:t xml:space="preserve"> Build responsive Navbar</w:t>
+      </w:r>
+      <w:r>
+        <w:br/>
+      </w:r>
+      <w:r>
+        <w:rPr>
+          <w:b/>
+          <w:bCs/>
+        </w:rPr>
+        <w:t>Day 5:</w:t>
+      </w:r>
+      <w:r>
+        <w:t xml:space="preserve"> Create Hero section for Landing Page</w:t>
+      </w:r>
+      <w:r>
+        <w:br/>
+      </w:r>
+      <w:r>
+        <w:rPr>
+          <w:b/>
+          <w:bCs/>
+        </w:rPr>
+        <w:t>Day 6:</w:t>
+      </w:r>
+      <w:r>
+        <w:t xml:space="preserve"> Add Features section</w:t>
+      </w:r>
+      <w:r>
+        <w:br/>
+      </w:r>
+      <w:r>
+        <w:rPr>
+          <w:b/>
+          <w:bCs/>
+        </w:rPr>
+        <w:t>Day 7:</w:t>
+      </w:r>
+      <w:r>
+        <w:t xml:space="preserve"> Add Footer and make Landing Page responsive</w:t>
+      </w:r>
+    </w:p>
+    <w:p>
+      <w:r>
+        <w:pict w14:anchorId="741D46FC">
+          <v:rect id="_x0000_i1025" style="width:0;height:1.5pt" o:hralign="center" o:hrstd="t" o:hr="t" fillcolor="#a0a0a0" stroked="f"/>
+        </w:pict>
+      </w:r>
     </w:p>
     <w:p>
       <w:pPr>
@@ -141,103 +191,103 @@
           <w:b/>
           <w:bCs/>
         </w:rPr>
-        <w:t>Week 1 – Setup &amp; Landing Page</w:t>
-      </w:r>
-    </w:p>
-    <w:p>
-      <w:r>
-        <w:rPr>
-          <w:b/>
-          <w:bCs/>
-        </w:rPr>
-        <w:t>Day 1:</w:t>
-      </w:r>
-      <w:r>
-        <w:t xml:space="preserve"> Initialize React project with Vite</w:t>
-      </w:r>
-      <w:r>
-        <w:br/>
-      </w:r>
-      <w:r>
-        <w:rPr>
-          <w:b/>
-          <w:bCs/>
-        </w:rPr>
-        <w:t>Day 2:</w:t>
-      </w:r>
-      <w:r>
-        <w:t xml:space="preserve"> Create project folder structure</w:t>
-      </w:r>
-      <w:r>
-        <w:br/>
-      </w:r>
-      <w:r>
-        <w:rPr>
-          <w:b/>
-          <w:bCs/>
-        </w:rPr>
-        <w:t>Day 3:</w:t>
-      </w:r>
-      <w:r>
-        <w:t xml:space="preserve"> Design color palette and typography system</w:t>
-      </w:r>
-      <w:r>
-        <w:br/>
-      </w:r>
-      <w:r>
-        <w:rPr>
-          <w:b/>
-          <w:bCs/>
-        </w:rPr>
-        <w:t>Day 4:</w:t>
-      </w:r>
-      <w:r>
-        <w:t xml:space="preserve"> Build responsive Navbar</w:t>
-      </w:r>
-      <w:r>
-        <w:br/>
-      </w:r>
-      <w:r>
-        <w:rPr>
-          <w:b/>
-          <w:bCs/>
-        </w:rPr>
-        <w:t>Day 5:</w:t>
-      </w:r>
-      <w:r>
-        <w:t xml:space="preserve"> Create Hero section for Landing Page</w:t>
-      </w:r>
-      <w:r>
-        <w:br/>
-      </w:r>
-      <w:r>
-        <w:rPr>
-          <w:b/>
-          <w:bCs/>
-        </w:rPr>
-        <w:t>Day 6:</w:t>
-      </w:r>
-      <w:r>
-        <w:t xml:space="preserve"> Add Features section</w:t>
-      </w:r>
-      <w:r>
-        <w:br/>
-      </w:r>
-      <w:r>
-        <w:rPr>
-          <w:b/>
-          <w:bCs/>
-        </w:rPr>
-        <w:t>Day 7:</w:t>
-      </w:r>
-      <w:r>
-        <w:t xml:space="preserve"> Add Footer and make Landing Page responsive</w:t>
-      </w:r>
-    </w:p>
-    <w:p>
-      <w:r>
-        <w:pict w14:anchorId="741D46FC">
-          <v:rect id="_x0000_i1067" style="width:0;height:1.5pt" o:hralign="center" o:hrstd="t" o:hr="t" fillcolor="#a0a0a0" stroked="f"/>
+        <w:t>Week 2 – Authentication</w:t>
+      </w:r>
+    </w:p>
+    <w:p>
+      <w:r>
+        <w:rPr>
+          <w:b/>
+          <w:bCs/>
+        </w:rPr>
+        <w:t>Day 8:</w:t>
+      </w:r>
+      <w:r>
+        <w:t xml:space="preserve"> Create Login Page UI</w:t>
+      </w:r>
+      <w:r>
+        <w:br/>
+      </w:r>
+      <w:r>
+        <w:rPr>
+          <w:b/>
+          <w:bCs/>
+        </w:rPr>
+        <w:t>Day 9:</w:t>
+      </w:r>
+      <w:r>
+        <w:t xml:space="preserve"> Create Signup Page UI</w:t>
+      </w:r>
+      <w:r>
+        <w:br/>
+      </w:r>
+      <w:r>
+        <w:rPr>
+          <w:b/>
+          <w:bCs/>
+        </w:rPr>
+        <w:t>Day 10:</w:t>
+      </w:r>
+      <w:r>
+        <w:t xml:space="preserve"> Add form validation</w:t>
+      </w:r>
+      <w:r>
+        <w:br/>
+      </w:r>
+      <w:r>
+        <w:rPr>
+          <w:b/>
+          <w:bCs/>
+        </w:rPr>
+        <w:t>Day 11:</w:t>
+      </w:r>
+      <w:r>
+        <w:t xml:space="preserve"> Create reusable Input component</w:t>
+      </w:r>
+      <w:r>
+        <w:br/>
+      </w:r>
+      <w:r>
+        <w:rPr>
+          <w:b/>
+          <w:bCs/>
+        </w:rPr>
+        <w:t>Day 12:</w:t>
+      </w:r>
+      <w:r>
+        <w:t xml:space="preserve"> Create reusable Button component</w:t>
+      </w:r>
+      <w:r>
+        <w:br/>
+      </w:r>
+      <w:r>
+        <w:rPr>
+          <w:b/>
+          <w:bCs/>
+        </w:rPr>
+        <w:t>Day 13:</w:t>
+      </w:r>
+      <w:r>
+        <w:t xml:space="preserve"> Improve Authentication page styling</w:t>
+      </w:r>
+      <w:r>
+        <w:br/>
+      </w:r>
+      <w:r>
+        <w:rPr>
+          <w:b/>
+          <w:bCs/>
+        </w:rPr>
+        <w:t>Day 14:</w:t>
+      </w:r>
+      <w:r>
+        <w:t xml:space="preserve"> Mobile responsiveness for auth pages</w:t>
+      </w:r>
+    </w:p>
+    <w:p>
+      <w:r>
+        <w:pict w14:anchorId="223918BA">
+          <v:rect id="_x0000_i1026" style="width:0;height:1.5pt" o:hralign="center" o:hrstd="t" o:hr="t" fillcolor="#a0a0a0" stroked="f"/>
         </w:pict>
       </w:r>
     </w:p>
@@ -253,118 +303,6 @@
           <w:b/>
           <w:bCs/>
         </w:rPr>
-        <w:t>Week 2 – Authentication</w:t>
-      </w:r>
-    </w:p>
-    <w:p>
-      <w:r>
-        <w:rPr>
-          <w:b/>
-          <w:bCs/>
-        </w:rPr>
-        <w:t>Day 8:</w:t>
-      </w:r>
-      <w:r>
-        <w:t xml:space="preserve"> Create Login Page UI</w:t>
-      </w:r>
-      <w:r>
-        <w:br/>
-      </w:r>
-      <w:r>
-        <w:rPr>
-          <w:b/>
-          <w:bCs/>
-        </w:rPr>
-        <w:t>Day 9:</w:t>
-      </w:r>
-      <w:r>
-        <w:t xml:space="preserve"> Create Signup Page UI</w:t>
-      </w:r>
-      <w:r>
-        <w:br/>
-      </w:r>
-      <w:r>
-        <w:rPr>
-          <w:b/>
-          <w:bCs/>
-        </w:rPr>
-        <w:t>Day 10:</w:t>
-      </w:r>
-      <w:r>
-        <w:t xml:space="preserve"> Add form validation</w:t>
-      </w:r>
-      <w:r>
-        <w:br/>
-      </w:r>
-      <w:r>
-        <w:rPr>
-          <w:b/>
-          <w:bCs/>
-        </w:rPr>
-        <w:t>Day 11:</w:t>
-      </w:r>
-      <w:r>
-        <w:t xml:space="preserve"> Create reusable Input component</w:t>
-      </w:r>
-      <w:r>
-        <w:br/>
-      </w:r>
-      <w:r>
-        <w:rPr>
-          <w:b/>
-          <w:bCs/>
-        </w:rPr>
-        <w:t>Day 12:</w:t>
-      </w:r>
-      <w:r>
-        <w:t xml:space="preserve"> Create reusable Button component</w:t>
-      </w:r>
-      <w:r>
-        <w:br/>
-      </w:r>
-      <w:r>
-        <w:rPr>
-          <w:b/>
-          <w:bCs/>
-        </w:rPr>
-        <w:t>Day 13:</w:t>
-      </w:r>
-      <w:r>
-        <w:t xml:space="preserve"> Improve Authentication page styling</w:t>
-      </w:r>
-      <w:r>
-        <w:br/>
-      </w:r>
-      <w:r>
-        <w:rPr>
-          <w:b/>
-          <w:bCs/>
-        </w:rPr>
-        <w:t>Day 14:</w:t>
-      </w:r>
-      <w:r>
-        <w:t xml:space="preserve"> Mobile responsiveness for auth pages</w:t>
-      </w:r>
-    </w:p>
-    <w:p>
-      <w:r>
-        <w:pict w14:anchorId="223918BA">
-          <v:rect id="_x0000_i1068" style="width:0;height:1.5pt" o:hralign="center" o:hrstd="t" o:hr="t" fillcolor="#a0a0a0" stroked="f"/>
-        </w:pict>
-      </w:r>
-    </w:p>
-    <w:p>
-      <w:pPr>
-        <w:rPr>
-          <w:b/>
-          <w:bCs/>
-        </w:rPr>
-      </w:pPr>
-      <w:r>
-        <w:rPr>
-          <w:b/>
-          <w:bCs/>
-        </w:rPr>
         <w:t>Week 3 – Dashboard</w:t>
       </w:r>
     </w:p>
@@ -461,7 +399,7 @@
     <w:p>
       <w:r>
         <w:pict w14:anchorId="03764FB2">
-          <v:rect id="_x0000_i1069" style="width:0;height:1.5pt" o:hralign="center" o:hrstd="t" o:hr="t" fillcolor="#a0a0a0" stroked="f"/>
+          <v:rect id="_x0000_i1027" style="width:0;height:1.5pt" o:hralign="center" o:hrstd="t" o:hr="t" fillcolor="#a0a0a0" stroked="f"/>
         </w:pict>
       </w:r>
     </w:p>
@@ -529,13 +467,8 @@
         <w:t>Day 25:</w:t>
       </w:r>
       <w:r>
-        <w:t xml:space="preserve"> Save cycle data using </w:t>
-      </w:r>
-      <w:proofErr w:type="spellStart"/>
-      <w:r>
-        <w:t>localStorage</w:t>
-      </w:r>
-      <w:proofErr w:type="spellEnd"/>
+        <w:t xml:space="preserve"> Save cycle data using localStorage</w:t>
+      </w:r>
       <w:r>
         <w:br/>
       </w:r>
@@ -579,7 +512,7 @@
     <w:p>
       <w:r>
         <w:pict w14:anchorId="6CDC1503">
-          <v:rect id="_x0000_i1070" style="width:0;height:1.5pt" o:hralign="center" o:hrstd="t" o:hr="t" fillcolor="#a0a0a0" stroked="f"/>
+          <v:rect id="_x0000_i1028" style="width:0;height:1.5pt" o:hralign="center" o:hrstd="t" o:hr="t" fillcolor="#a0a0a0" stroked="f"/>
         </w:pict>
       </w:r>
     </w:p>
@@ -706,7 +639,7 @@
     <w:p>
       <w:r>
         <w:pict w14:anchorId="521EFA84">
-          <v:rect id="_x0000_i1071" style="width:0;height:1.5pt" o:hralign="center" o:hrstd="t" o:hr="t" fillcolor="#a0a0a0" stroked="f"/>
+          <v:rect id="_x0000_i1029" style="width:0;height:1.5pt" o:hralign="center" o:hrstd="t" o:hr="t" fillcolor="#a0a0a0" stroked="f"/>
         </w:pict>
       </w:r>
     </w:p>
@@ -818,7 +751,7 @@
     <w:p>
       <w:r>
         <w:pict w14:anchorId="097D7F7C">
-          <v:rect id="_x0000_i1072" style="width:0;height:1.5pt" o:hralign="center" o:hrstd="t" o:hr="t" fillcolor="#a0a0a0" stroked="f"/>
+          <v:rect id="_x0000_i1030" style="width:0;height:1.5pt" o:hralign="center" o:hrstd="t" o:hr="t" fillcolor="#a0a0a0" stroked="f"/>
         </w:pict>
       </w:r>
     </w:p>
@@ -930,7 +863,7 @@
     <w:p>
       <w:r>
         <w:pict w14:anchorId="2E90703F">
-          <v:rect id="_x0000_i1073" style="width:0;height:1.5pt" o:hralign="center" o:hrstd="t" o:hr="t" fillcolor="#a0a0a0" stroked="f"/>
+          <v:rect id="_x0000_i1031" style="width:0;height:1.5pt" o:hralign="center" o:hrstd="t" o:hr="t" fillcolor="#a0a0a0" stroked="f"/>
         </w:pict>
       </w:r>
     </w:p>
@@ -1093,6 +1026,11 @@
       </w:r>
     </w:p>
     <w:p/>
+    <w:p>
+      <w:r>
+        <w:t>Today I tried to install react Calander package but that crashed my web-17-6-2026………</w:t>
+      </w:r>
+    </w:p>
     <w:sectPr>
       <w:pgSz w:w="12240" w:h="15840"/>
       <w:pgMar w:top="1440" w:right="1440" w:bottom="1440" w:left="1440" w:header="720" w:footer="720" w:gutter="0"/>
@@ -1706,6 +1644,7 @@
   <w:style w:type="character" w:default="1" w:styleId="DefaultParagraphFont">
     <w:name w:val="Default Paragraph Font"/>
     <w:uiPriority w:val="1"/>
+    <w:semiHidden/>
     <w:unhideWhenUsed/>
   </w:style>
   <w:style w:type="table" w:default="1" w:styleId="TableNormal">

</xml_diff>